<commit_message>
fix: comprehensive fix for all frontend-backend integration issues
- Fix SignalType/RiskLevel enum serialization (model_dump mode=json)
- Fix Sidebar agent status: dynamic from API instead of hardcoded
- Fix Dashboard agent status: show blue when execution_count > 0
- Fix API routes: remove strict response_model for alerts/reports
- Fix API timeout: increase analyzeStock to 120s
- Add error messages to all Vue pages (Analyze/Chat/Reports/Alerts)
- Configure DashScope qwen-plus as primary LLM model
</commit_message>
<xml_diff>
--- a/docs/AFAC2026报名信息表.docx
+++ b/docs/AFAC2026报名信息表.docx
@@ -440,6 +440,45 @@
                 <w:color w:val="FFFFFF"/>
                 <w:sz w:val="22"/>
               </w:rPr>
+              <w:t>单位名称</w:t>
+            </w:r>
+          </w:p>
+        </w:tc>
+        <w:tc>
+          <w:tcPr>
+            <w:tcW w:type="dxa" w:w="6803"/>
+          </w:tcPr>
+          <w:p>
+            <w:r/>
+            <w:r>
+              <w:rPr>
+                <w:rFonts w:ascii="微软雅黑" w:hAnsi="微软雅黑" w:eastAsia="微软雅黑"/>
+                <w:b w:val="0"/>
+                <w:sz w:val="21"/>
+              </w:rPr>
+              <w:t>个人独立创业</w:t>
+            </w:r>
+          </w:p>
+        </w:tc>
+      </w:tr>
+      <w:tr>
+        <w:tc>
+          <w:tcPr>
+            <w:tcW w:type="dxa" w:w="2268"/>
+            <w:shd w:fill="1A3C6E"/>
+          </w:tcPr>
+          <w:p>
+            <w:pPr>
+              <w:jc w:val="center"/>
+            </w:pPr>
+            <w:r/>
+            <w:r>
+              <w:rPr>
+                <w:rFonts w:ascii="微软雅黑" w:hAnsi="微软雅黑" w:eastAsia="微软雅黑"/>
+                <w:b/>
+                <w:color w:val="FFFFFF"/>
+                <w:sz w:val="22"/>
+              </w:rPr>
               <w:t>团队模式</w:t>
             </w:r>
           </w:p>
@@ -447,6 +486,7 @@
         <w:tc>
           <w:tcPr>
             <w:tcW w:type="dxa" w:w="6803"/>
+            <w:shd w:fill="EDF2F9"/>
           </w:tcPr>
           <w:p>
             <w:r/>
@@ -486,7 +526,6 @@
         <w:tc>
           <w:tcPr>
             <w:tcW w:type="dxa" w:w="6803"/>
-            <w:shd w:fill="EDF2F9"/>
           </w:tcPr>
           <w:p>
             <w:r/>
@@ -560,7 +599,7 @@
           <w:b w:val="0"/>
           <w:sz w:val="21"/>
         </w:rPr>
-        <w:t>核心创新点：（1）ReAct推理引擎——每个智能体具备“思考→行动→观察”循环，不是简单工具调用，而是真正自主推理；（2）持久记忆系统——工作记忆+情节记忆+语义记忆三层架构，让数字员工“记住”上下文和历史经验；（3）主动智能——定时巡检+事件驱动+阈值预警，推动金融服务从被动响应迈向主动智能；（4）合规内嵌——内置银保监会/证监会监管规则引擎，每步操作可审计可追溯；（5）多智能体协商——6大专业智能体（市场分析/新闻舆情/风控合规/投资策略/报告生成/执行监控）协同工作，加权协商生成最终建议；（6）思维链可视化——实时展示AI推理过程，让决策“看得见”。以国产大模型为基座，数据不出境，安全可信。</w:t>
+        <w:t>核心创新点：（1）ReAct推理引擎——每个智能体具备"思考→行动→观察"循环，真正自主推理；（2）持久记忆系统——工作记忆+情节记忆+语义记忆三层架构，让数字员工"记住"上下文和历史经验；（3）主动智能——定时巡检+事件驱动+阈值预警，推动金融服务从被动响应迈向主动智能；（4）合规内嵌——内置银保监会/证监会监管规则引擎，每步操作可审计可追溯；（5）多智能体协商——6大专业智能体（市场分析/新闻舆情/风控合规/投资策略/报告生成/执行监控）协同工作，加权协商生成最终建议；（6）思维链可视化——实时展示AI推理过程，让决策"看得见"。以国产大模型为基座，数据不出境，安全可信。</w:t>
       </w:r>
     </w:p>
     <w:p>
@@ -592,7 +631,7 @@
           <w:b w:val="0"/>
           <w:sz w:val="21"/>
         </w:rPr>
-        <w:t>智融先锋由浙江大学计算机通信工程专业本科生冯亦根独立创立，是一支聚焦金融自主智能体（Agentic AI）的OPC一人团队。冯亦根兼具AI与通信工程复合背景，独立完成FinAgent Pro金融智能体平台从架构设计到全栈开发的全流程——涵盖ReAct推理引擎、三层记忆系统、6大专业智能体协同调度、合规规则引擎及Vue3前端，以一人之力构建了完整的金融数字员工系统。团队坚持“技术创新+合规内嵌”双轮驱动，以国产大模型为基座，打造安全可信的金融智能体平台，推动金融服务从被动响应迈向主动智能。一个人，一支队，以一当十。</w:t>
+        <w:t>智融先锋由浙江大学计算机通信工程专业本科生冯亦根独立创立，是一支聚焦金融自主智能体（Agentic AI）的OPC一人团队。冯亦根兼具AI与通信工程复合背景，独立完成FinAgent Pro金融智能体平台从架构设计到全栈开发的全流程——涵盖ReAct推理引擎、三层记忆系统、6大专业智能体协同调度、合规规则引擎及Vue3前端，以一人之力构建了完整的金融数字员工系统。团队坚持"技术创新+合规内嵌"双轮驱动，以国产大模型为基座，打造安全可信的金融智能体平台，推动金融服务从被动响应迈向主动智能。一个人，一支队，以一当十。</w:t>
       </w:r>
     </w:p>
     <w:p>
@@ -610,7 +649,57 @@
           <w:color w:val="1A3C6E"/>
           <w:sz w:val="32"/>
         </w:rPr>
-        <w:t>四、团队概况（详细版）</w:t>
+        <w:t>四、目标客户群体（多选）</w:t>
+      </w:r>
+    </w:p>
+    <w:p>
+      <w:pPr>
+        <w:spacing w:after="120"/>
+      </w:pPr>
+      <w:r>
+        <w:rPr>
+          <w:rFonts w:ascii="微软雅黑" w:hAnsi="微软雅黑" w:eastAsia="微软雅黑"/>
+          <w:b/>
+          <w:color w:val="1A3C6E"/>
+          <w:sz w:val="22"/>
+        </w:rPr>
+        <w:t>已选：</w:t>
+      </w:r>
+      <w:r>
+        <w:rPr>
+          <w:rFonts w:ascii="微软雅黑" w:hAnsi="微软雅黑" w:eastAsia="微软雅黑"/>
+          <w:b/>
+          <w:color w:val="2B5C9E"/>
+          <w:sz w:val="21"/>
+        </w:rPr>
+        <w:t xml:space="preserve">  [银行]  </w:t>
+      </w:r>
+      <w:r>
+        <w:rPr>
+          <w:rFonts w:ascii="微软雅黑" w:hAnsi="微软雅黑" w:eastAsia="微软雅黑"/>
+          <w:b/>
+          <w:color w:val="2B5C9E"/>
+          <w:sz w:val="21"/>
+        </w:rPr>
+        <w:t xml:space="preserve">  [证券公司]  </w:t>
+      </w:r>
+      <w:r>
+        <w:rPr>
+          <w:rFonts w:ascii="微软雅黑" w:hAnsi="微软雅黑" w:eastAsia="微软雅黑"/>
+          <w:b/>
+          <w:color w:val="2B5C9E"/>
+          <w:sz w:val="21"/>
+        </w:rPr>
+        <w:t xml:space="preserve">  [基金公司]  </w:t>
+      </w:r>
+      <w:r>
+        <w:rPr>
+          <w:rFonts w:ascii="微软雅黑" w:hAnsi="微软雅黑" w:eastAsia="微软雅黑"/>
+          <w:b/>
+          <w:color w:val="2B5C9E"/>
+          <w:sz w:val="21"/>
+        </w:rPr>
+        <w:t xml:space="preserve">  [个人投资者]  </w:t>
       </w:r>
     </w:p>
     <w:p>
@@ -624,35 +713,7 @@
           <w:b w:val="0"/>
           <w:sz w:val="21"/>
         </w:rPr>
-        <w:t>智融先锋是一支OPC一人团队，由创始人冯亦根独立运营。冯亦根毕业于浙江大学计算机通信工程专业，兼具人工智能与通信工程复合技术背景，熟练掌握大语言模型应用开发、多智能体系统架构设计、全栈工程等核心能力。</w:t>
-      </w:r>
-    </w:p>
-    <w:p>
-      <w:pPr>
-        <w:spacing w:after="120" w:line="400" w:lineRule="exact"/>
-        <w:ind w:firstLine="420"/>
-      </w:pPr>
-      <w:r>
-        <w:rPr>
-          <w:rFonts w:ascii="微软雅黑" w:hAnsi="微软雅黑" w:eastAsia="微软雅黑"/>
-          <w:b w:val="0"/>
-          <w:sz w:val="21"/>
-        </w:rPr>
-        <w:t>在FinAgent Pro项目中，冯亦根以一人之力独立完成了从产品定义、架构设计到前后端全栈开发的全部工作——涵盖ReAct推理引擎、三层记忆系统、6大专业智能体协同调度、合规规则引擎及Vue3前端界面，代码量超7000行。</w:t>
-      </w:r>
-    </w:p>
-    <w:p>
-      <w:pPr>
-        <w:spacing w:after="120" w:line="400" w:lineRule="exact"/>
-        <w:ind w:firstLine="420"/>
-      </w:pPr>
-      <w:r>
-        <w:rPr>
-          <w:rFonts w:ascii="微软雅黑" w:hAnsi="微软雅黑" w:eastAsia="微软雅黑"/>
-          <w:b w:val="0"/>
-          <w:sz w:val="21"/>
-        </w:rPr>
-        <w:t>团队以“一个人，一支队，以一当十”为信条，充分发挥AI原生开发优势：用智能体架构倍增个人生产力，用自动化工具替代重复劳动，用极简主义聚焦核心价值，实现了一人团队的高效运转。未来团队将根据业务发展需要，优先在金融合规和商务拓展方向引入合伙人，持续保持技术团队的精简高效。</w:t>
+        <w:t>银行：财富管理部、资产管理部需要智能投研和合规审计；证券公司：最直接客户，需要市场分析、交易信号、风控合规；基金公司：组合分析、风险评估、投资策略生成；个人投资者：C端产品方向，降低专业投资门槛。</w:t>
       </w:r>
     </w:p>
     <w:p>
@@ -670,7 +731,1654 @@
           <w:color w:val="1A3C6E"/>
           <w:sz w:val="32"/>
         </w:rPr>
-        <w:t>五、提交材料清单</w:t>
+        <w:t>五、预计市场规模（年）</w:t>
+      </w:r>
+    </w:p>
+    <w:p>
+      <w:pPr>
+        <w:spacing w:after="120"/>
+      </w:pPr>
+      <w:r>
+        <w:rPr>
+          <w:rFonts w:ascii="微软雅黑" w:hAnsi="微软雅黑" w:eastAsia="微软雅黑"/>
+          <w:b/>
+          <w:color w:val="1A3C6E"/>
+          <w:sz w:val="22"/>
+        </w:rPr>
+        <w:t>已选：</w:t>
+      </w:r>
+      <w:r>
+        <w:rPr>
+          <w:rFonts w:ascii="微软雅黑" w:hAnsi="微软雅黑" w:eastAsia="微软雅黑"/>
+          <w:b/>
+          <w:color w:val="2B5C9E"/>
+          <w:sz w:val="21"/>
+        </w:rPr>
+        <w:t xml:space="preserve">  [&gt;10亿元]  </w:t>
+      </w:r>
+    </w:p>
+    <w:p>
+      <w:pPr>
+        <w:spacing w:after="120" w:line="400" w:lineRule="exact"/>
+        <w:ind w:firstLine="420"/>
+      </w:pPr>
+      <w:r>
+        <w:rPr>
+          <w:rFonts w:ascii="微软雅黑" w:hAnsi="微软雅黑" w:eastAsia="微软雅黑"/>
+          <w:b w:val="0"/>
+          <w:sz w:val="21"/>
+        </w:rPr>
+        <w:t>中国AI+金融市场2026年预计超千亿规模，金融自主智能体是核心增长赛道。B端：100+证券公司×100-500万/年 + 150+基金公司×100-300万/年 + 数千家银行财富管理部×50-200万/年，仅B端就超10亿。C端：数千万A股个人投资者，订阅制/SaaS模式潜力巨大。</w:t>
+      </w:r>
+    </w:p>
+    <w:p>
+      <w:pPr>
+        <w:spacing w:after="200" w:before="360"/>
+        <w:jc w:val="left"/>
+        <w:pBdr>
+          <w:bottom w:val="single" w:sz="8" w:space="4" w:color="1A3C6E"/>
+        </w:pBdr>
+      </w:pPr>
+      <w:r>
+        <w:rPr>
+          <w:rFonts w:ascii="微软雅黑" w:hAnsi="微软雅黑" w:eastAsia="微软雅黑"/>
+          <w:b/>
+          <w:color w:val="1A3C6E"/>
+          <w:sz w:val="32"/>
+        </w:rPr>
+        <w:t>六、主要收入模式（多选）</w:t>
+      </w:r>
+    </w:p>
+    <w:p>
+      <w:pPr>
+        <w:spacing w:after="120"/>
+      </w:pPr>
+      <w:r>
+        <w:rPr>
+          <w:rFonts w:ascii="微软雅黑" w:hAnsi="微软雅黑" w:eastAsia="微软雅黑"/>
+          <w:b/>
+          <w:color w:val="1A3C6E"/>
+          <w:sz w:val="22"/>
+        </w:rPr>
+        <w:t>已选：</w:t>
+      </w:r>
+      <w:r>
+        <w:rPr>
+          <w:rFonts w:ascii="微软雅黑" w:hAnsi="微软雅黑" w:eastAsia="微软雅黑"/>
+          <w:b/>
+          <w:color w:val="2B5C9E"/>
+          <w:sz w:val="21"/>
+        </w:rPr>
+        <w:t xml:space="preserve">  [软件订阅]  </w:t>
+      </w:r>
+      <w:r>
+        <w:rPr>
+          <w:rFonts w:ascii="微软雅黑" w:hAnsi="微软雅黑" w:eastAsia="微软雅黑"/>
+          <w:b/>
+          <w:color w:val="2B5C9E"/>
+          <w:sz w:val="21"/>
+        </w:rPr>
+        <w:t xml:space="preserve">  [技术服务费]  </w:t>
+      </w:r>
+      <w:r>
+        <w:rPr>
+          <w:rFonts w:ascii="微软雅黑" w:hAnsi="微软雅黑" w:eastAsia="微软雅黑"/>
+          <w:b/>
+          <w:color w:val="2B5C9E"/>
+          <w:sz w:val="21"/>
+        </w:rPr>
+        <w:t xml:space="preserve">  [数据服务]  </w:t>
+      </w:r>
+    </w:p>
+    <w:p>
+      <w:pPr>
+        <w:spacing w:after="120" w:line="400" w:lineRule="exact"/>
+        <w:ind w:firstLine="420"/>
+      </w:pPr>
+      <w:r>
+        <w:rPr>
+          <w:rFonts w:ascii="微软雅黑" w:hAnsi="微软雅黑" w:eastAsia="微软雅黑"/>
+          <w:b w:val="0"/>
+          <w:sz w:val="21"/>
+        </w:rPr>
+        <w:t>软件订阅：核心模式，SaaS按年/按席位收费，B端稳定现金流，C端会员订阅；技术服务费：金融机构定制化部署、私有化适配、系统集成，单项目几十万起；数据服务：智能体产出的投研报告、风控数据、舆情指标作为数据产品出售。</w:t>
+      </w:r>
+    </w:p>
+    <w:p>
+      <w:pPr>
+        <w:spacing w:after="200" w:before="360"/>
+        <w:jc w:val="left"/>
+        <w:pBdr>
+          <w:bottom w:val="single" w:sz="8" w:space="4" w:color="1A3C6E"/>
+        </w:pBdr>
+      </w:pPr>
+      <w:r>
+        <w:rPr>
+          <w:rFonts w:ascii="微软雅黑" w:hAnsi="微软雅黑" w:eastAsia="微软雅黑"/>
+          <w:b/>
+          <w:color w:val="1A3C6E"/>
+          <w:sz w:val="32"/>
+        </w:rPr>
+        <w:t>七、项目解决的主要痛点（多选）</w:t>
+      </w:r>
+    </w:p>
+    <w:p>
+      <w:pPr>
+        <w:spacing w:after="120"/>
+      </w:pPr>
+      <w:r>
+        <w:rPr>
+          <w:rFonts w:ascii="微软雅黑" w:hAnsi="微软雅黑" w:eastAsia="微软雅黑"/>
+          <w:b/>
+          <w:color w:val="1A3C6E"/>
+          <w:sz w:val="22"/>
+        </w:rPr>
+        <w:t>已选：</w:t>
+      </w:r>
+      <w:r>
+        <w:rPr>
+          <w:rFonts w:ascii="微软雅黑" w:hAnsi="微软雅黑" w:eastAsia="微软雅黑"/>
+          <w:b/>
+          <w:color w:val="2B5C9E"/>
+          <w:sz w:val="21"/>
+        </w:rPr>
+        <w:t xml:space="preserve">  [信息孤岛]  </w:t>
+      </w:r>
+      <w:r>
+        <w:rPr>
+          <w:rFonts w:ascii="微软雅黑" w:hAnsi="微软雅黑" w:eastAsia="微软雅黑"/>
+          <w:b/>
+          <w:color w:val="2B5C9E"/>
+          <w:sz w:val="21"/>
+        </w:rPr>
+        <w:t xml:space="preserve">  [合规风险]  </w:t>
+      </w:r>
+      <w:r>
+        <w:rPr>
+          <w:rFonts w:ascii="微软雅黑" w:hAnsi="微软雅黑" w:eastAsia="微软雅黑"/>
+          <w:b/>
+          <w:color w:val="2B5C9E"/>
+          <w:sz w:val="21"/>
+        </w:rPr>
+        <w:t xml:space="preserve">  [效率低下]  </w:t>
+      </w:r>
+      <w:r>
+        <w:rPr>
+          <w:rFonts w:ascii="微软雅黑" w:hAnsi="微软雅黑" w:eastAsia="微软雅黑"/>
+          <w:b/>
+          <w:color w:val="2B5C9E"/>
+          <w:sz w:val="21"/>
+        </w:rPr>
+        <w:t xml:space="preserve">  [决策黑盒]  </w:t>
+      </w:r>
+    </w:p>
+    <w:p>
+      <w:pPr>
+        <w:spacing w:after="120" w:line="400" w:lineRule="exact"/>
+        <w:ind w:firstLine="420"/>
+      </w:pPr>
+      <w:r>
+        <w:rPr>
+          <w:rFonts w:ascii="微软雅黑" w:hAnsi="微软雅黑" w:eastAsia="微软雅黑"/>
+          <w:b w:val="0"/>
+          <w:sz w:val="21"/>
+        </w:rPr>
+        <w:t>信息孤岛：市场数据、新闻舆情、风控合规分散在不同系统，FinAgent Pro通过6大智能体协同打通信息壁垒；合规风险：AI决策过程不透明，难以满足监管审计要求，合规规则引擎确保每步可追溯；效率低下：分析师日均仅覆盖3-5只标的，数字员工7×24小时全市场扫描；决策黑盒：思维链可视化让AI推理过程实时可见，黑盒变白盒。</w:t>
+      </w:r>
+    </w:p>
+    <w:p>
+      <w:pPr>
+        <w:spacing w:after="200" w:before="360"/>
+        <w:jc w:val="left"/>
+        <w:pBdr>
+          <w:bottom w:val="single" w:sz="8" w:space="4" w:color="1A3C6E"/>
+        </w:pBdr>
+      </w:pPr>
+      <w:r>
+        <w:rPr>
+          <w:rFonts w:ascii="微软雅黑" w:hAnsi="微软雅黑" w:eastAsia="微软雅黑"/>
+          <w:b/>
+          <w:color w:val="1A3C6E"/>
+          <w:sz w:val="32"/>
+        </w:rPr>
+        <w:t>八、与现有解决方案相比最大优势（多选）</w:t>
+      </w:r>
+    </w:p>
+    <w:p>
+      <w:pPr>
+        <w:spacing w:after="120"/>
+      </w:pPr>
+      <w:r>
+        <w:rPr>
+          <w:rFonts w:ascii="微软雅黑" w:hAnsi="微软雅黑" w:eastAsia="微软雅黑"/>
+          <w:b/>
+          <w:color w:val="1A3C6E"/>
+          <w:sz w:val="22"/>
+        </w:rPr>
+        <w:t>已选：</w:t>
+      </w:r>
+      <w:r>
+        <w:rPr>
+          <w:rFonts w:ascii="微软雅黑" w:hAnsi="微软雅黑" w:eastAsia="微软雅黑"/>
+          <w:b/>
+          <w:color w:val="2B5C9E"/>
+          <w:sz w:val="21"/>
+        </w:rPr>
+        <w:t xml:space="preserve">  [技术创新]  </w:t>
+      </w:r>
+      <w:r>
+        <w:rPr>
+          <w:rFonts w:ascii="微软雅黑" w:hAnsi="微软雅黑" w:eastAsia="微软雅黑"/>
+          <w:b/>
+          <w:color w:val="2B5C9E"/>
+          <w:sz w:val="21"/>
+        </w:rPr>
+        <w:t xml:space="preserve">  [合规内嵌]  </w:t>
+      </w:r>
+      <w:r>
+        <w:rPr>
+          <w:rFonts w:ascii="微软雅黑" w:hAnsi="微软雅黑" w:eastAsia="微软雅黑"/>
+          <w:b/>
+          <w:color w:val="2B5C9E"/>
+          <w:sz w:val="21"/>
+        </w:rPr>
+        <w:t xml:space="preserve">  [主动智能]  </w:t>
+      </w:r>
+      <w:r>
+        <w:rPr>
+          <w:rFonts w:ascii="微软雅黑" w:hAnsi="微软雅黑" w:eastAsia="微软雅黑"/>
+          <w:b/>
+          <w:color w:val="2B5C9E"/>
+          <w:sz w:val="21"/>
+        </w:rPr>
+        <w:t xml:space="preserve">  [国产自主]  </w:t>
+      </w:r>
+    </w:p>
+    <w:p>
+      <w:pPr>
+        <w:spacing w:after="120" w:line="400" w:lineRule="exact"/>
+        <w:ind w:firstLine="420"/>
+      </w:pPr>
+      <w:r>
+        <w:rPr>
+          <w:rFonts w:ascii="微软雅黑" w:hAnsi="微软雅黑" w:eastAsia="微软雅黑"/>
+          <w:b w:val="0"/>
+          <w:sz w:val="21"/>
+        </w:rPr>
+        <w:t>技术创新：ReAct推理引擎+三层记忆+多智能体协商，三层架构是技术护城河；合规内嵌：规则引擎+审计中间件，金融机构采购的硬性准入壁垒；主动智能：定时巡检+事件驱动+阈值预警，从被动响应到主动服务的体验壁垒；国产自主：GLM-5.1/DeepSeek/SenseNova国产大模型基座，数据不出境，安全可信。</w:t>
+      </w:r>
+    </w:p>
+    <w:p>
+      <w:pPr>
+        <w:spacing w:after="200" w:before="360"/>
+        <w:jc w:val="left"/>
+        <w:pBdr>
+          <w:bottom w:val="single" w:sz="8" w:space="4" w:color="1A3C6E"/>
+        </w:pBdr>
+      </w:pPr>
+      <w:r>
+        <w:rPr>
+          <w:rFonts w:ascii="微软雅黑" w:hAnsi="微软雅黑" w:eastAsia="微软雅黑"/>
+          <w:b/>
+          <w:color w:val="1A3C6E"/>
+          <w:sz w:val="32"/>
+        </w:rPr>
+        <w:t>九、市场竞争分析</w:t>
+      </w:r>
+    </w:p>
+    <w:p>
+      <w:pPr>
+        <w:spacing w:after="120" w:line="400" w:lineRule="exact"/>
+        <w:ind w:firstLine="420"/>
+      </w:pPr>
+      <w:r>
+        <w:rPr>
+          <w:rFonts w:ascii="微软雅黑" w:hAnsi="微软雅黑" w:eastAsia="微软雅黑"/>
+          <w:b w:val="0"/>
+          <w:sz w:val="21"/>
+        </w:rPr>
+        <w:t>当前金融智能体市场主要有三类竞争者：</w:t>
+      </w:r>
+    </w:p>
+    <w:tbl>
+      <w:tblPr>
+        <w:tblStyle w:val="TableGrid"/>
+        <w:tblW w:type="auto" w:w="0"/>
+        <w:jc w:val="center"/>
+        <w:tblLook w:firstColumn="1" w:firstRow="1" w:lastColumn="0" w:lastRow="0" w:noHBand="0" w:noVBand="1" w:val="04A0"/>
+      </w:tblPr>
+      <w:tblGrid>
+        <w:gridCol w:w="2078"/>
+        <w:gridCol w:w="2078"/>
+        <w:gridCol w:w="2078"/>
+        <w:gridCol w:w="2078"/>
+      </w:tblGrid>
+      <w:tr>
+        <w:tc>
+          <w:tcPr>
+            <w:tcW w:type="dxa" w:w="1701"/>
+            <w:shd w:fill="1A3C6E"/>
+          </w:tcPr>
+          <w:p>
+            <w:pPr>
+              <w:jc w:val="center"/>
+            </w:pPr>
+            <w:r/>
+            <w:r>
+              <w:rPr>
+                <w:rFonts w:ascii="微软雅黑" w:hAnsi="微软雅黑" w:eastAsia="微软雅黑"/>
+                <w:b/>
+                <w:color w:val="FFFFFF"/>
+                <w:sz w:val="22"/>
+              </w:rPr>
+              <w:t>竞争者</w:t>
+            </w:r>
+          </w:p>
+        </w:tc>
+        <w:tc>
+          <w:tcPr>
+            <w:tcW w:type="dxa" w:w="1984"/>
+            <w:shd w:fill="1A3C6E"/>
+          </w:tcPr>
+          <w:p>
+            <w:pPr>
+              <w:jc w:val="center"/>
+            </w:pPr>
+            <w:r/>
+            <w:r>
+              <w:rPr>
+                <w:rFonts w:ascii="微软雅黑" w:hAnsi="微软雅黑" w:eastAsia="微软雅黑"/>
+                <w:b/>
+                <w:color w:val="FFFFFF"/>
+                <w:sz w:val="22"/>
+              </w:rPr>
+              <w:t>优势</w:t>
+            </w:r>
+          </w:p>
+        </w:tc>
+        <w:tc>
+          <w:tcPr>
+            <w:tcW w:type="dxa" w:w="1984"/>
+            <w:shd w:fill="1A3C6E"/>
+          </w:tcPr>
+          <w:p>
+            <w:pPr>
+              <w:jc w:val="center"/>
+            </w:pPr>
+            <w:r/>
+            <w:r>
+              <w:rPr>
+                <w:rFonts w:ascii="微软雅黑" w:hAnsi="微软雅黑" w:eastAsia="微软雅黑"/>
+                <w:b/>
+                <w:color w:val="FFFFFF"/>
+                <w:sz w:val="22"/>
+              </w:rPr>
+              <w:t>劣势</w:t>
+            </w:r>
+          </w:p>
+        </w:tc>
+        <w:tc>
+          <w:tcPr>
+            <w:tcW w:type="dxa" w:w="2835"/>
+            <w:shd w:fill="1A3C6E"/>
+          </w:tcPr>
+          <w:p>
+            <w:pPr>
+              <w:jc w:val="center"/>
+            </w:pPr>
+            <w:r/>
+            <w:r>
+              <w:rPr>
+                <w:rFonts w:ascii="微软雅黑" w:hAnsi="微软雅黑" w:eastAsia="微软雅黑"/>
+                <w:b/>
+                <w:color w:val="FFFFFF"/>
+                <w:sz w:val="22"/>
+              </w:rPr>
+              <w:t>FinAgent Pro差异化</w:t>
+            </w:r>
+          </w:p>
+        </w:tc>
+      </w:tr>
+      <w:tr>
+        <w:tc>
+          <w:tcPr>
+            <w:tcW w:type="dxa" w:w="1701"/>
+          </w:tcPr>
+          <w:p>
+            <w:pPr>
+              <w:jc w:val="center"/>
+            </w:pPr>
+            <w:r/>
+            <w:r>
+              <w:rPr>
+                <w:rFonts w:ascii="微软雅黑" w:hAnsi="微软雅黑" w:eastAsia="微软雅黑"/>
+                <w:b/>
+                <w:sz w:val="21"/>
+              </w:rPr>
+              <w:t>传统金融终端</w:t>
+              <w:br/>
+              <w:t>(同花顺/Wind)</w:t>
+            </w:r>
+          </w:p>
+        </w:tc>
+        <w:tc>
+          <w:tcPr>
+            <w:tcW w:type="dxa" w:w="1984"/>
+          </w:tcPr>
+          <w:p>
+            <w:pPr>
+              <w:jc w:val="left"/>
+            </w:pPr>
+            <w:r/>
+            <w:r>
+              <w:rPr>
+                <w:rFonts w:ascii="微软雅黑" w:hAnsi="微软雅黑" w:eastAsia="微软雅黑"/>
+                <w:b w:val="0"/>
+                <w:sz w:val="21"/>
+              </w:rPr>
+              <w:t>数据覆盖广</w:t>
+              <w:br/>
+              <w:t>用户基数大</w:t>
+            </w:r>
+          </w:p>
+        </w:tc>
+        <w:tc>
+          <w:tcPr>
+            <w:tcW w:type="dxa" w:w="1984"/>
+          </w:tcPr>
+          <w:p>
+            <w:pPr>
+              <w:jc w:val="left"/>
+            </w:pPr>
+            <w:r/>
+            <w:r>
+              <w:rPr>
+                <w:rFonts w:ascii="微软雅黑" w:hAnsi="微软雅黑" w:eastAsia="微软雅黑"/>
+                <w:b w:val="0"/>
+                <w:sz w:val="21"/>
+              </w:rPr>
+              <w:t>被动工具</w:t>
+              <w:br/>
+              <w:t>AI能力薄弱</w:t>
+            </w:r>
+          </w:p>
+        </w:tc>
+        <w:tc>
+          <w:tcPr>
+            <w:tcW w:type="dxa" w:w="2835"/>
+          </w:tcPr>
+          <w:p>
+            <w:pPr>
+              <w:jc w:val="left"/>
+            </w:pPr>
+            <w:r/>
+            <w:r>
+              <w:rPr>
+                <w:rFonts w:ascii="微软雅黑" w:hAnsi="微软雅黑" w:eastAsia="微软雅黑"/>
+                <w:b w:val="0"/>
+                <w:sz w:val="21"/>
+              </w:rPr>
+              <w:t>主动智能体替代被动工具</w:t>
+              <w:br/>
+              <w:t>从人找数据到数据找人</w:t>
+            </w:r>
+          </w:p>
+        </w:tc>
+      </w:tr>
+      <w:tr>
+        <w:tc>
+          <w:tcPr>
+            <w:tcW w:type="dxa" w:w="1701"/>
+            <w:shd w:fill="EDF2F9"/>
+          </w:tcPr>
+          <w:p>
+            <w:pPr>
+              <w:jc w:val="center"/>
+            </w:pPr>
+            <w:r/>
+            <w:r>
+              <w:rPr>
+                <w:rFonts w:ascii="微软雅黑" w:hAnsi="微软雅黑" w:eastAsia="微软雅黑"/>
+                <w:b/>
+                <w:sz w:val="21"/>
+              </w:rPr>
+              <w:t>通用AI平台</w:t>
+              <w:br/>
+              <w:t>(文心/通义/GLM)</w:t>
+            </w:r>
+          </w:p>
+        </w:tc>
+        <w:tc>
+          <w:tcPr>
+            <w:tcW w:type="dxa" w:w="1984"/>
+            <w:shd w:fill="EDF2F9"/>
+          </w:tcPr>
+          <w:p>
+            <w:pPr>
+              <w:jc w:val="left"/>
+            </w:pPr>
+            <w:r/>
+            <w:r>
+              <w:rPr>
+                <w:rFonts w:ascii="微软雅黑" w:hAnsi="微软雅黑" w:eastAsia="微软雅黑"/>
+                <w:b w:val="0"/>
+                <w:sz w:val="21"/>
+              </w:rPr>
+              <w:t>大模型能力强</w:t>
+              <w:br/>
+              <w:t>算力资源丰富</w:t>
+            </w:r>
+          </w:p>
+        </w:tc>
+        <w:tc>
+          <w:tcPr>
+            <w:tcW w:type="dxa" w:w="1984"/>
+            <w:shd w:fill="EDF2F9"/>
+          </w:tcPr>
+          <w:p>
+            <w:pPr>
+              <w:jc w:val="left"/>
+            </w:pPr>
+            <w:r/>
+            <w:r>
+              <w:rPr>
+                <w:rFonts w:ascii="微软雅黑" w:hAnsi="微软雅黑" w:eastAsia="微软雅黑"/>
+                <w:b w:val="0"/>
+                <w:sz w:val="21"/>
+              </w:rPr>
+              <w:t>缺乏金融垂直深度</w:t>
+              <w:br/>
+              <w:t>无合规引擎</w:t>
+            </w:r>
+          </w:p>
+        </w:tc>
+        <w:tc>
+          <w:tcPr>
+            <w:tcW w:type="dxa" w:w="2835"/>
+            <w:shd w:fill="EDF2F9"/>
+          </w:tcPr>
+          <w:p>
+            <w:pPr>
+              <w:jc w:val="left"/>
+            </w:pPr>
+            <w:r/>
+            <w:r>
+              <w:rPr>
+                <w:rFonts w:ascii="微软雅黑" w:hAnsi="微软雅黑" w:eastAsia="微软雅黑"/>
+                <w:b w:val="0"/>
+                <w:sz w:val="21"/>
+              </w:rPr>
+              <w:t>金融垂直深度定制</w:t>
+              <w:br/>
+              <w:t>6智能体协同+合规内嵌</w:t>
+            </w:r>
+          </w:p>
+        </w:tc>
+      </w:tr>
+      <w:tr>
+        <w:tc>
+          <w:tcPr>
+            <w:tcW w:type="dxa" w:w="1701"/>
+          </w:tcPr>
+          <w:p>
+            <w:pPr>
+              <w:jc w:val="center"/>
+            </w:pPr>
+            <w:r/>
+            <w:r>
+              <w:rPr>
+                <w:rFonts w:ascii="微软雅黑" w:hAnsi="微软雅黑" w:eastAsia="微软雅黑"/>
+                <w:b/>
+                <w:sz w:val="21"/>
+              </w:rPr>
+              <w:t>海外金融AI</w:t>
+              <w:br/>
+              <w:t>(Bloomberg GPT)</w:t>
+            </w:r>
+          </w:p>
+        </w:tc>
+        <w:tc>
+          <w:tcPr>
+            <w:tcW w:type="dxa" w:w="1984"/>
+          </w:tcPr>
+          <w:p>
+            <w:pPr>
+              <w:jc w:val="left"/>
+            </w:pPr>
+            <w:r/>
+            <w:r>
+              <w:rPr>
+                <w:rFonts w:ascii="微软雅黑" w:hAnsi="微软雅黑" w:eastAsia="微软雅黑"/>
+                <w:b w:val="0"/>
+                <w:sz w:val="21"/>
+              </w:rPr>
+              <w:t>技术成熟</w:t>
+              <w:br/>
+              <w:t>海外验证</w:t>
+            </w:r>
+          </w:p>
+        </w:tc>
+        <w:tc>
+          <w:tcPr>
+            <w:tcW w:type="dxa" w:w="1984"/>
+          </w:tcPr>
+          <w:p>
+            <w:pPr>
+              <w:jc w:val="left"/>
+            </w:pPr>
+            <w:r/>
+            <w:r>
+              <w:rPr>
+                <w:rFonts w:ascii="微软雅黑" w:hAnsi="微软雅黑" w:eastAsia="微软雅黑"/>
+                <w:b w:val="0"/>
+                <w:sz w:val="21"/>
+              </w:rPr>
+              <w:t>不支持A股</w:t>
+              <w:br/>
+              <w:t>数据出境风险</w:t>
+            </w:r>
+          </w:p>
+        </w:tc>
+        <w:tc>
+          <w:tcPr>
+            <w:tcW w:type="dxa" w:w="2835"/>
+          </w:tcPr>
+          <w:p>
+            <w:pPr>
+              <w:jc w:val="left"/>
+            </w:pPr>
+            <w:r/>
+            <w:r>
+              <w:rPr>
+                <w:rFonts w:ascii="微软雅黑" w:hAnsi="微软雅黑" w:eastAsia="微软雅黑"/>
+                <w:b w:val="0"/>
+                <w:sz w:val="21"/>
+              </w:rPr>
+              <w:t>国产基座+A股数据</w:t>
+              <w:br/>
+              <w:t>中文NLP+合规引擎</w:t>
+            </w:r>
+          </w:p>
+        </w:tc>
+      </w:tr>
+    </w:tbl>
+    <w:p/>
+    <w:p>
+      <w:pPr>
+        <w:spacing w:after="120" w:line="400" w:lineRule="exact"/>
+        <w:ind w:firstLine="420"/>
+      </w:pPr>
+      <w:r>
+        <w:rPr>
+          <w:rFonts w:ascii="微软雅黑" w:hAnsi="微软雅黑" w:eastAsia="微软雅黑"/>
+          <w:b w:val="0"/>
+          <w:sz w:val="21"/>
+        </w:rPr>
+        <w:t>FinAgent Pro的核心竞争壁垒：（1）技术护城河：三层架构（智能体引擎+协同调度+主动智能），竞品仅做到单层；（2）准入壁垒：合规内嵌是金融机构采购的硬性要求；（3）体验壁垒：主动智能让用户一旦习惯就难以回到被动模式。</w:t>
+      </w:r>
+    </w:p>
+    <w:p>
+      <w:pPr>
+        <w:spacing w:after="200" w:before="360"/>
+        <w:jc w:val="left"/>
+        <w:pBdr>
+          <w:bottom w:val="single" w:sz="8" w:space="4" w:color="1A3C6E"/>
+        </w:pBdr>
+      </w:pPr>
+      <w:r>
+        <w:rPr>
+          <w:rFonts w:ascii="微软雅黑" w:hAnsi="微软雅黑" w:eastAsia="微软雅黑"/>
+          <w:b/>
+          <w:color w:val="1A3C6E"/>
+          <w:sz w:val="32"/>
+        </w:rPr>
+        <w:t>十、核心技术与创新</w:t>
+      </w:r>
+    </w:p>
+    <w:tbl>
+      <w:tblPr>
+        <w:tblStyle w:val="TableGrid"/>
+        <w:tblW w:type="auto" w:w="0"/>
+        <w:jc w:val="center"/>
+        <w:tblLook w:firstColumn="1" w:firstRow="1" w:lastColumn="0" w:lastRow="0" w:noHBand="0" w:noVBand="1" w:val="04A0"/>
+      </w:tblPr>
+      <w:tblGrid>
+        <w:gridCol w:w="2771"/>
+        <w:gridCol w:w="2771"/>
+        <w:gridCol w:w="2771"/>
+      </w:tblGrid>
+      <w:tr>
+        <w:tc>
+          <w:tcPr>
+            <w:tcW w:type="dxa" w:w="1701"/>
+            <w:shd w:fill="1A3C6E"/>
+          </w:tcPr>
+          <w:p>
+            <w:pPr>
+              <w:jc w:val="center"/>
+            </w:pPr>
+            <w:r/>
+            <w:r>
+              <w:rPr>
+                <w:rFonts w:ascii="微软雅黑" w:hAnsi="微软雅黑" w:eastAsia="微软雅黑"/>
+                <w:b/>
+                <w:color w:val="FFFFFF"/>
+                <w:sz w:val="22"/>
+              </w:rPr>
+              <w:t>技术领域</w:t>
+            </w:r>
+          </w:p>
+        </w:tc>
+        <w:tc>
+          <w:tcPr>
+            <w:tcW w:type="dxa" w:w="2551"/>
+            <w:shd w:fill="1A3C6E"/>
+          </w:tcPr>
+          <w:p>
+            <w:pPr>
+              <w:jc w:val="center"/>
+            </w:pPr>
+            <w:r/>
+            <w:r>
+              <w:rPr>
+                <w:rFonts w:ascii="微软雅黑" w:hAnsi="微软雅黑" w:eastAsia="微软雅黑"/>
+                <w:b/>
+                <w:color w:val="FFFFFF"/>
+                <w:sz w:val="22"/>
+              </w:rPr>
+              <w:t>核心技术</w:t>
+            </w:r>
+          </w:p>
+        </w:tc>
+        <w:tc>
+          <w:tcPr>
+            <w:tcW w:type="dxa" w:w="4535"/>
+            <w:shd w:fill="1A3C6E"/>
+          </w:tcPr>
+          <w:p>
+            <w:pPr>
+              <w:jc w:val="center"/>
+            </w:pPr>
+            <w:r/>
+            <w:r>
+              <w:rPr>
+                <w:rFonts w:ascii="微软雅黑" w:hAnsi="微软雅黑" w:eastAsia="微软雅黑"/>
+                <w:b/>
+                <w:color w:val="FFFFFF"/>
+                <w:sz w:val="22"/>
+              </w:rPr>
+              <w:t>关键能力</w:t>
+            </w:r>
+          </w:p>
+        </w:tc>
+      </w:tr>
+      <w:tr>
+        <w:tc>
+          <w:tcPr>
+            <w:tcW w:type="dxa" w:w="1701"/>
+          </w:tcPr>
+          <w:p>
+            <w:pPr>
+              <w:jc w:val="center"/>
+            </w:pPr>
+            <w:r/>
+            <w:r>
+              <w:rPr>
+                <w:rFonts w:ascii="微软雅黑" w:hAnsi="微软雅黑" w:eastAsia="微软雅黑"/>
+                <w:b/>
+                <w:sz w:val="21"/>
+              </w:rPr>
+              <w:t>大语言模型</w:t>
+            </w:r>
+          </w:p>
+        </w:tc>
+        <w:tc>
+          <w:tcPr>
+            <w:tcW w:type="dxa" w:w="2551"/>
+          </w:tcPr>
+          <w:p>
+            <w:pPr>
+              <w:jc w:val="left"/>
+            </w:pPr>
+            <w:r/>
+            <w:r>
+              <w:rPr>
+                <w:rFonts w:ascii="微软雅黑" w:hAnsi="微软雅黑" w:eastAsia="微软雅黑"/>
+                <w:b w:val="0"/>
+                <w:sz w:val="21"/>
+              </w:rPr>
+              <w:t>ReAct推理引擎</w:t>
+            </w:r>
+          </w:p>
+        </w:tc>
+        <w:tc>
+          <w:tcPr>
+            <w:tcW w:type="dxa" w:w="4535"/>
+          </w:tcPr>
+          <w:p>
+            <w:pPr>
+              <w:jc w:val="left"/>
+            </w:pPr>
+            <w:r/>
+            <w:r>
+              <w:rPr>
+                <w:rFonts w:ascii="微软雅黑" w:hAnsi="微软雅黑" w:eastAsia="微软雅黑"/>
+                <w:b w:val="0"/>
+                <w:sz w:val="21"/>
+              </w:rPr>
+              <w:t>Thought-Action-Observation自主推理循环</w:t>
+            </w:r>
+          </w:p>
+        </w:tc>
+      </w:tr>
+      <w:tr>
+        <w:tc>
+          <w:tcPr>
+            <w:tcW w:type="dxa" w:w="1701"/>
+            <w:shd w:fill="EDF2F9"/>
+          </w:tcPr>
+          <w:p>
+            <w:pPr>
+              <w:jc w:val="center"/>
+            </w:pPr>
+            <w:r/>
+            <w:r>
+              <w:rPr>
+                <w:rFonts w:ascii="微软雅黑" w:hAnsi="微软雅黑" w:eastAsia="微软雅黑"/>
+                <w:b/>
+                <w:sz w:val="21"/>
+              </w:rPr>
+              <w:t>多智能体协同</w:t>
+            </w:r>
+          </w:p>
+        </w:tc>
+        <w:tc>
+          <w:tcPr>
+            <w:tcW w:type="dxa" w:w="2551"/>
+            <w:shd w:fill="EDF2F9"/>
+          </w:tcPr>
+          <w:p>
+            <w:pPr>
+              <w:jc w:val="left"/>
+            </w:pPr>
+            <w:r/>
+            <w:r>
+              <w:rPr>
+                <w:rFonts w:ascii="微软雅黑" w:hAnsi="微软雅黑" w:eastAsia="微软雅黑"/>
+                <w:b w:val="0"/>
+                <w:sz w:val="21"/>
+              </w:rPr>
+              <w:t>Master Orchestrator</w:t>
+            </w:r>
+          </w:p>
+        </w:tc>
+        <w:tc>
+          <w:tcPr>
+            <w:tcW w:type="dxa" w:w="4535"/>
+            <w:shd w:fill="EDF2F9"/>
+          </w:tcPr>
+          <w:p>
+            <w:pPr>
+              <w:jc w:val="left"/>
+            </w:pPr>
+            <w:r/>
+            <w:r>
+              <w:rPr>
+                <w:rFonts w:ascii="微软雅黑" w:hAnsi="微软雅黑" w:eastAsia="微软雅黑"/>
+                <w:b w:val="0"/>
+                <w:sz w:val="21"/>
+              </w:rPr>
+              <w:t>三阶段流水线+加权协商+LLM增强推理</w:t>
+            </w:r>
+          </w:p>
+        </w:tc>
+      </w:tr>
+      <w:tr>
+        <w:tc>
+          <w:tcPr>
+            <w:tcW w:type="dxa" w:w="1701"/>
+          </w:tcPr>
+          <w:p>
+            <w:pPr>
+              <w:jc w:val="center"/>
+            </w:pPr>
+            <w:r/>
+            <w:r>
+              <w:rPr>
+                <w:rFonts w:ascii="微软雅黑" w:hAnsi="微软雅黑" w:eastAsia="微软雅黑"/>
+                <w:b/>
+                <w:sz w:val="21"/>
+              </w:rPr>
+              <w:t>记忆系统</w:t>
+            </w:r>
+          </w:p>
+        </w:tc>
+        <w:tc>
+          <w:tcPr>
+            <w:tcW w:type="dxa" w:w="2551"/>
+          </w:tcPr>
+          <w:p>
+            <w:pPr>
+              <w:jc w:val="left"/>
+            </w:pPr>
+            <w:r/>
+            <w:r>
+              <w:rPr>
+                <w:rFonts w:ascii="微软雅黑" w:hAnsi="微软雅黑" w:eastAsia="微软雅黑"/>
+                <w:b w:val="0"/>
+                <w:sz w:val="21"/>
+              </w:rPr>
+              <w:t>三层记忆架构</w:t>
+            </w:r>
+          </w:p>
+        </w:tc>
+        <w:tc>
+          <w:tcPr>
+            <w:tcW w:type="dxa" w:w="4535"/>
+          </w:tcPr>
+          <w:p>
+            <w:pPr>
+              <w:jc w:val="left"/>
+            </w:pPr>
+            <w:r/>
+            <w:r>
+              <w:rPr>
+                <w:rFonts w:ascii="微软雅黑" w:hAnsi="微软雅黑" w:eastAsia="微软雅黑"/>
+                <w:b w:val="0"/>
+                <w:sz w:val="21"/>
+              </w:rPr>
+              <w:t>工作记忆+情节记忆+语义记忆</w:t>
+            </w:r>
+          </w:p>
+        </w:tc>
+      </w:tr>
+      <w:tr>
+        <w:tc>
+          <w:tcPr>
+            <w:tcW w:type="dxa" w:w="1701"/>
+            <w:shd w:fill="EDF2F9"/>
+          </w:tcPr>
+          <w:p>
+            <w:pPr>
+              <w:jc w:val="center"/>
+            </w:pPr>
+            <w:r/>
+            <w:r>
+              <w:rPr>
+                <w:rFonts w:ascii="微软雅黑" w:hAnsi="微软雅黑" w:eastAsia="微软雅黑"/>
+                <w:b/>
+                <w:sz w:val="21"/>
+              </w:rPr>
+              <w:t>主动智能</w:t>
+            </w:r>
+          </w:p>
+        </w:tc>
+        <w:tc>
+          <w:tcPr>
+            <w:tcW w:type="dxa" w:w="2551"/>
+            <w:shd w:fill="EDF2F9"/>
+          </w:tcPr>
+          <w:p>
+            <w:pPr>
+              <w:jc w:val="left"/>
+            </w:pPr>
+            <w:r/>
+            <w:r>
+              <w:rPr>
+                <w:rFonts w:ascii="微软雅黑" w:hAnsi="微软雅黑" w:eastAsia="微软雅黑"/>
+                <w:b w:val="0"/>
+                <w:sz w:val="21"/>
+              </w:rPr>
+              <w:t>APScheduler+WebSocket</w:t>
+            </w:r>
+          </w:p>
+        </w:tc>
+        <w:tc>
+          <w:tcPr>
+            <w:tcW w:type="dxa" w:w="4535"/>
+            <w:shd w:fill="EDF2F9"/>
+          </w:tcPr>
+          <w:p>
+            <w:pPr>
+              <w:jc w:val="left"/>
+            </w:pPr>
+            <w:r/>
+            <w:r>
+              <w:rPr>
+                <w:rFonts w:ascii="微软雅黑" w:hAnsi="微软雅黑" w:eastAsia="微软雅黑"/>
+                <w:b w:val="0"/>
+                <w:sz w:val="21"/>
+              </w:rPr>
+              <w:t>定时巡检+事件驱动+阈值预警</w:t>
+            </w:r>
+          </w:p>
+        </w:tc>
+      </w:tr>
+      <w:tr>
+        <w:tc>
+          <w:tcPr>
+            <w:tcW w:type="dxa" w:w="1701"/>
+          </w:tcPr>
+          <w:p>
+            <w:pPr>
+              <w:jc w:val="center"/>
+            </w:pPr>
+            <w:r/>
+            <w:r>
+              <w:rPr>
+                <w:rFonts w:ascii="微软雅黑" w:hAnsi="微软雅黑" w:eastAsia="微软雅黑"/>
+                <w:b/>
+                <w:sz w:val="21"/>
+              </w:rPr>
+              <w:t>合规引擎</w:t>
+            </w:r>
+          </w:p>
+        </w:tc>
+        <w:tc>
+          <w:tcPr>
+            <w:tcW w:type="dxa" w:w="2551"/>
+          </w:tcPr>
+          <w:p>
+            <w:pPr>
+              <w:jc w:val="left"/>
+            </w:pPr>
+            <w:r/>
+            <w:r>
+              <w:rPr>
+                <w:rFonts w:ascii="微软雅黑" w:hAnsi="微软雅黑" w:eastAsia="微软雅黑"/>
+                <w:b w:val="0"/>
+                <w:sz w:val="21"/>
+              </w:rPr>
+              <w:t>规则引擎+审计中间件</w:t>
+            </w:r>
+          </w:p>
+        </w:tc>
+        <w:tc>
+          <w:tcPr>
+            <w:tcW w:type="dxa" w:w="4535"/>
+          </w:tcPr>
+          <w:p>
+            <w:pPr>
+              <w:jc w:val="left"/>
+            </w:pPr>
+            <w:r/>
+            <w:r>
+              <w:rPr>
+                <w:rFonts w:ascii="微软雅黑" w:hAnsi="微软雅黑" w:eastAsia="微软雅黑"/>
+                <w:b w:val="0"/>
+                <w:sz w:val="21"/>
+              </w:rPr>
+              <w:t>四维风控+合规约束+全链路审计</w:t>
+            </w:r>
+          </w:p>
+        </w:tc>
+      </w:tr>
+      <w:tr>
+        <w:tc>
+          <w:tcPr>
+            <w:tcW w:type="dxa" w:w="1701"/>
+            <w:shd w:fill="EDF2F9"/>
+          </w:tcPr>
+          <w:p>
+            <w:pPr>
+              <w:jc w:val="center"/>
+            </w:pPr>
+            <w:r/>
+            <w:r>
+              <w:rPr>
+                <w:rFonts w:ascii="微软雅黑" w:hAnsi="微软雅黑" w:eastAsia="微软雅黑"/>
+                <w:b/>
+                <w:sz w:val="21"/>
+              </w:rPr>
+              <w:t>金融计算</w:t>
+            </w:r>
+          </w:p>
+        </w:tc>
+        <w:tc>
+          <w:tcPr>
+            <w:tcW w:type="dxa" w:w="2551"/>
+            <w:shd w:fill="EDF2F9"/>
+          </w:tcPr>
+          <w:p>
+            <w:pPr>
+              <w:jc w:val="left"/>
+            </w:pPr>
+            <w:r/>
+            <w:r>
+              <w:rPr>
+                <w:rFonts w:ascii="微软雅黑" w:hAnsi="微软雅黑" w:eastAsia="微软雅黑"/>
+                <w:b w:val="0"/>
+                <w:sz w:val="21"/>
+              </w:rPr>
+              <w:t>AKShare+ta-lib</w:t>
+            </w:r>
+          </w:p>
+        </w:tc>
+        <w:tc>
+          <w:tcPr>
+            <w:tcW w:type="dxa" w:w="4535"/>
+            <w:shd w:fill="EDF2F9"/>
+          </w:tcPr>
+          <w:p>
+            <w:pPr>
+              <w:jc w:val="left"/>
+            </w:pPr>
+            <w:r/>
+            <w:r>
+              <w:rPr>
+                <w:rFonts w:ascii="微软雅黑" w:hAnsi="微软雅黑" w:eastAsia="微软雅黑"/>
+                <w:b w:val="0"/>
+                <w:sz w:val="21"/>
+              </w:rPr>
+              <w:t>A股行情+技术指标+VaR风险计算</w:t>
+            </w:r>
+          </w:p>
+        </w:tc>
+      </w:tr>
+      <w:tr>
+        <w:tc>
+          <w:tcPr>
+            <w:tcW w:type="dxa" w:w="1701"/>
+          </w:tcPr>
+          <w:p>
+            <w:pPr>
+              <w:jc w:val="center"/>
+            </w:pPr>
+            <w:r/>
+            <w:r>
+              <w:rPr>
+                <w:rFonts w:ascii="微软雅黑" w:hAnsi="微软雅黑" w:eastAsia="微软雅黑"/>
+                <w:b/>
+                <w:sz w:val="21"/>
+              </w:rPr>
+              <w:t>工程架构</w:t>
+            </w:r>
+          </w:p>
+        </w:tc>
+        <w:tc>
+          <w:tcPr>
+            <w:tcW w:type="dxa" w:w="2551"/>
+          </w:tcPr>
+          <w:p>
+            <w:pPr>
+              <w:jc w:val="left"/>
+            </w:pPr>
+            <w:r/>
+            <w:r>
+              <w:rPr>
+                <w:rFonts w:ascii="微软雅黑" w:hAnsi="微软雅黑" w:eastAsia="微软雅黑"/>
+                <w:b w:val="0"/>
+                <w:sz w:val="21"/>
+              </w:rPr>
+              <w:t>FastAPI+Vue3+Docker</w:t>
+            </w:r>
+          </w:p>
+        </w:tc>
+        <w:tc>
+          <w:tcPr>
+            <w:tcW w:type="dxa" w:w="4535"/>
+          </w:tcPr>
+          <w:p>
+            <w:pPr>
+              <w:jc w:val="left"/>
+            </w:pPr>
+            <w:r/>
+            <w:r>
+              <w:rPr>
+                <w:rFonts w:ascii="微软雅黑" w:hAnsi="微软雅黑" w:eastAsia="微软雅黑"/>
+                <w:b w:val="0"/>
+                <w:sz w:val="21"/>
+              </w:rPr>
+              <w:t>异步API+暗色主题+容器化部署</w:t>
+            </w:r>
+          </w:p>
+        </w:tc>
+      </w:tr>
+    </w:tbl>
+    <w:p/>
+    <w:p>
+      <w:pPr>
+        <w:spacing w:after="200" w:before="360"/>
+        <w:jc w:val="left"/>
+        <w:pBdr>
+          <w:bottom w:val="single" w:sz="8" w:space="4" w:color="1A3C6E"/>
+        </w:pBdr>
+      </w:pPr>
+      <w:r>
+        <w:rPr>
+          <w:rFonts w:ascii="微软雅黑" w:hAnsi="微软雅黑" w:eastAsia="微软雅黑"/>
+          <w:b/>
+          <w:color w:val="1A3C6E"/>
+          <w:sz w:val="32"/>
+        </w:rPr>
+        <w:t>十一、参赛期望（多选）</w:t>
+      </w:r>
+    </w:p>
+    <w:p>
+      <w:pPr>
+        <w:spacing w:after="120"/>
+      </w:pPr>
+      <w:r>
+        <w:rPr>
+          <w:rFonts w:ascii="微软雅黑" w:hAnsi="微软雅黑" w:eastAsia="微软雅黑"/>
+          <w:b/>
+          <w:color w:val="1A3C6E"/>
+          <w:sz w:val="22"/>
+        </w:rPr>
+        <w:t>已选：</w:t>
+      </w:r>
+      <w:r>
+        <w:rPr>
+          <w:rFonts w:ascii="微软雅黑" w:hAnsi="微软雅黑" w:eastAsia="微软雅黑"/>
+          <w:b/>
+          <w:color w:val="2B5C9E"/>
+          <w:sz w:val="21"/>
+        </w:rPr>
+        <w:t xml:space="preserve">  [行业认可]  </w:t>
+      </w:r>
+      <w:r>
+        <w:rPr>
+          <w:rFonts w:ascii="微软雅黑" w:hAnsi="微软雅黑" w:eastAsia="微软雅黑"/>
+          <w:b/>
+          <w:color w:val="2B5C9E"/>
+          <w:sz w:val="21"/>
+        </w:rPr>
+        <w:t xml:space="preserve">  [投资机会]  </w:t>
+      </w:r>
+      <w:r>
+        <w:rPr>
+          <w:rFonts w:ascii="微软雅黑" w:hAnsi="微软雅黑" w:eastAsia="微软雅黑"/>
+          <w:b/>
+          <w:color w:val="2B5C9E"/>
+          <w:sz w:val="21"/>
+        </w:rPr>
+        <w:t xml:space="preserve">  [业务合作]  </w:t>
+      </w:r>
+      <w:r>
+        <w:rPr>
+          <w:rFonts w:ascii="微软雅黑" w:hAnsi="微软雅黑" w:eastAsia="微软雅黑"/>
+          <w:b/>
+          <w:color w:val="2B5C9E"/>
+          <w:sz w:val="21"/>
+        </w:rPr>
+        <w:t xml:space="preserve">  [专家指导]  </w:t>
+      </w:r>
+    </w:p>
+    <w:p>
+      <w:pPr>
+        <w:spacing w:after="120" w:line="400" w:lineRule="exact"/>
+        <w:ind w:firstLine="420"/>
+      </w:pPr>
+      <w:r>
+        <w:rPr>
+          <w:rFonts w:ascii="微软雅黑" w:hAnsi="微软雅黑" w:eastAsia="微软雅黑"/>
+          <w:b w:val="0"/>
+          <w:sz w:val="21"/>
+        </w:rPr>
+        <w:t>行业认可：AFAC是蚂蚁集团主办，获奖即获金融科技领域背书；投资机会：大赛对接蚂蚁战投、红杉等头部机构，是融资快车道；业务合作：蚂蚁生态内金融机构资源，B端客户对接效率高10倍；专家指导：蚂蚁技术专家1对1辅导，对产品打磨和商业模式优化价值极大。</w:t>
+      </w:r>
+    </w:p>
+    <w:p>
+      <w:pPr>
+        <w:spacing w:after="200" w:before="360"/>
+        <w:jc w:val="left"/>
+        <w:pBdr>
+          <w:bottom w:val="single" w:sz="8" w:space="4" w:color="1A3C6E"/>
+        </w:pBdr>
+      </w:pPr>
+      <w:r>
+        <w:rPr>
+          <w:rFonts w:ascii="微软雅黑" w:hAnsi="微软雅黑" w:eastAsia="微软雅黑"/>
+          <w:b/>
+          <w:color w:val="1A3C6E"/>
+          <w:sz w:val="32"/>
+        </w:rPr>
+        <w:t>十二、项目Demo材料清单</w:t>
+      </w:r>
+    </w:p>
+    <w:tbl>
+      <w:tblPr>
+        <w:tblStyle w:val="TableGrid"/>
+        <w:tblW w:type="auto" w:w="0"/>
+        <w:jc w:val="center"/>
+        <w:tblLook w:firstColumn="1" w:firstRow="1" w:lastColumn="0" w:lastRow="0" w:noHBand="0" w:noVBand="1" w:val="04A0"/>
+      </w:tblPr>
+      <w:tblGrid>
+        <w:gridCol w:w="2771"/>
+        <w:gridCol w:w="2771"/>
+        <w:gridCol w:w="2771"/>
+      </w:tblGrid>
+      <w:tr>
+        <w:tc>
+          <w:tcPr>
+            <w:tcW w:type="dxa" w:w="2268"/>
+            <w:shd w:fill="1A3C6E"/>
+          </w:tcPr>
+          <w:p>
+            <w:pPr>
+              <w:jc w:val="center"/>
+            </w:pPr>
+            <w:r/>
+            <w:r>
+              <w:rPr>
+                <w:rFonts w:ascii="微软雅黑" w:hAnsi="微软雅黑" w:eastAsia="微软雅黑"/>
+                <w:b/>
+                <w:color w:val="FFFFFF"/>
+                <w:sz w:val="22"/>
+              </w:rPr>
+              <w:t>材料项</w:t>
+            </w:r>
+          </w:p>
+        </w:tc>
+        <w:tc>
+          <w:tcPr>
+            <w:tcW w:type="dxa" w:w="1984"/>
+            <w:shd w:fill="1A3C6E"/>
+          </w:tcPr>
+          <w:p>
+            <w:pPr>
+              <w:jc w:val="center"/>
+            </w:pPr>
+            <w:r/>
+            <w:r>
+              <w:rPr>
+                <w:rFonts w:ascii="微软雅黑" w:hAnsi="微软雅黑" w:eastAsia="微软雅黑"/>
+                <w:b/>
+                <w:color w:val="FFFFFF"/>
+                <w:sz w:val="22"/>
+              </w:rPr>
+              <w:t>类型</w:t>
+            </w:r>
+          </w:p>
+        </w:tc>
+        <w:tc>
+          <w:tcPr>
+            <w:tcW w:type="dxa" w:w="4535"/>
+            <w:shd w:fill="1A3C6E"/>
+          </w:tcPr>
+          <w:p>
+            <w:pPr>
+              <w:jc w:val="center"/>
+            </w:pPr>
+            <w:r/>
+            <w:r>
+              <w:rPr>
+                <w:rFonts w:ascii="微软雅黑" w:hAnsi="微软雅黑" w:eastAsia="微软雅黑"/>
+                <w:b/>
+                <w:color w:val="FFFFFF"/>
+                <w:sz w:val="22"/>
+              </w:rPr>
+              <w:t>文件/链接</w:t>
+            </w:r>
+          </w:p>
+        </w:tc>
+      </w:tr>
+      <w:tr>
+        <w:tc>
+          <w:tcPr>
+            <w:tcW w:type="dxa" w:w="2268"/>
+          </w:tcPr>
+          <w:p>
+            <w:pPr>
+              <w:jc w:val="center"/>
+            </w:pPr>
+            <w:r/>
+            <w:r>
+              <w:rPr>
+                <w:rFonts w:ascii="微软雅黑" w:hAnsi="微软雅黑" w:eastAsia="微软雅黑"/>
+                <w:b/>
+                <w:sz w:val="21"/>
+              </w:rPr>
+              <w:t>a.可运行产品原型</w:t>
+            </w:r>
+          </w:p>
+        </w:tc>
+        <w:tc>
+          <w:tcPr>
+            <w:tcW w:type="dxa" w:w="1984"/>
+          </w:tcPr>
+          <w:p>
+            <w:pPr>
+              <w:jc w:val="left"/>
+            </w:pPr>
+            <w:r/>
+            <w:r>
+              <w:rPr>
+                <w:rFonts w:ascii="微软雅黑" w:hAnsi="微软雅黑" w:eastAsia="微软雅黑"/>
+                <w:b w:val="0"/>
+                <w:sz w:val="21"/>
+              </w:rPr>
+              <w:t>网页/App/小程序/文件</w:t>
+            </w:r>
+          </w:p>
+        </w:tc>
+        <w:tc>
+          <w:tcPr>
+            <w:tcW w:type="dxa" w:w="4535"/>
+          </w:tcPr>
+          <w:p>
+            <w:pPr>
+              <w:jc w:val="left"/>
+            </w:pPr>
+            <w:r/>
+            <w:r>
+              <w:rPr>
+                <w:rFonts w:ascii="微软雅黑" w:hAnsi="微软雅黑" w:eastAsia="微软雅黑"/>
+                <w:b w:val="0"/>
+                <w:sz w:val="21"/>
+              </w:rPr>
+              <w:t>GitHub: https://github.com/yigenfeng0707-netizen/finagent-pro-afac2026</w:t>
+              <w:br/>
+              <w:t>本地部署: 前端localhost:3000 + 后端localhost:8000</w:t>
+            </w:r>
+          </w:p>
+        </w:tc>
+      </w:tr>
+      <w:tr>
+        <w:tc>
+          <w:tcPr>
+            <w:tcW w:type="dxa" w:w="2268"/>
+            <w:shd w:fill="EDF2F9"/>
+          </w:tcPr>
+          <w:p>
+            <w:pPr>
+              <w:jc w:val="center"/>
+            </w:pPr>
+            <w:r/>
+            <w:r>
+              <w:rPr>
+                <w:rFonts w:ascii="微软雅黑" w:hAnsi="微软雅黑" w:eastAsia="微软雅黑"/>
+                <w:b/>
+                <w:sz w:val="21"/>
+              </w:rPr>
+              <w:t>b.3分钟功能演示视频</w:t>
+            </w:r>
+          </w:p>
+        </w:tc>
+        <w:tc>
+          <w:tcPr>
+            <w:tcW w:type="dxa" w:w="1984"/>
+            <w:shd w:fill="EDF2F9"/>
+          </w:tcPr>
+          <w:p>
+            <w:pPr>
+              <w:jc w:val="left"/>
+            </w:pPr>
+            <w:r/>
+            <w:r>
+              <w:rPr>
+                <w:rFonts w:ascii="微软雅黑" w:hAnsi="微软雅黑" w:eastAsia="微软雅黑"/>
+                <w:b w:val="0"/>
+                <w:sz w:val="21"/>
+              </w:rPr>
+              <w:t>视频格式/链接</w:t>
+            </w:r>
+          </w:p>
+        </w:tc>
+        <w:tc>
+          <w:tcPr>
+            <w:tcW w:type="dxa" w:w="4535"/>
+            <w:shd w:fill="EDF2F9"/>
+          </w:tcPr>
+          <w:p>
+            <w:pPr>
+              <w:jc w:val="left"/>
+            </w:pPr>
+            <w:r/>
+            <w:r>
+              <w:rPr>
+                <w:rFonts w:ascii="微软雅黑" w:hAnsi="微软雅黑" w:eastAsia="微软雅黑"/>
+                <w:b w:val="0"/>
+                <w:sz w:val="21"/>
+              </w:rPr>
+              <w:t>待录制（按DemoScript.md脚本操作录屏）</w:t>
+            </w:r>
+          </w:p>
+        </w:tc>
+      </w:tr>
+      <w:tr>
+        <w:tc>
+          <w:tcPr>
+            <w:tcW w:type="dxa" w:w="2268"/>
+          </w:tcPr>
+          <w:p>
+            <w:pPr>
+              <w:jc w:val="center"/>
+            </w:pPr>
+            <w:r/>
+            <w:r>
+              <w:rPr>
+                <w:rFonts w:ascii="微软雅黑" w:hAnsi="微软雅黑" w:eastAsia="微软雅黑"/>
+                <w:b/>
+                <w:sz w:val="21"/>
+              </w:rPr>
+              <w:t>c.高保真交互设计图/逻辑流程图</w:t>
+            </w:r>
+          </w:p>
+        </w:tc>
+        <w:tc>
+          <w:tcPr>
+            <w:tcW w:type="dxa" w:w="1984"/>
+          </w:tcPr>
+          <w:p>
+            <w:pPr>
+              <w:jc w:val="left"/>
+            </w:pPr>
+            <w:r/>
+            <w:r>
+              <w:rPr>
+                <w:rFonts w:ascii="微软雅黑" w:hAnsi="微软雅黑" w:eastAsia="微软雅黑"/>
+                <w:b w:val="0"/>
+                <w:sz w:val="21"/>
+              </w:rPr>
+              <w:t>图片/PDF/链接</w:t>
+            </w:r>
+          </w:p>
+        </w:tc>
+        <w:tc>
+          <w:tcPr>
+            <w:tcW w:type="dxa" w:w="4535"/>
+          </w:tcPr>
+          <w:p>
+            <w:pPr>
+              <w:jc w:val="left"/>
+            </w:pPr>
+            <w:r/>
+            <w:r>
+              <w:rPr>
+                <w:rFonts w:ascii="微软雅黑" w:hAnsi="微软雅黑" w:eastAsia="微软雅黑"/>
+                <w:b w:val="0"/>
+                <w:sz w:val="21"/>
+              </w:rPr>
+              <w:t>FinAgentPro交互设计与流程图.docx</w:t>
+              <w:br/>
+              <w:t>含4个页面原型+5个系统流程图</w:t>
+            </w:r>
+          </w:p>
+        </w:tc>
+      </w:tr>
+      <w:tr>
+        <w:tc>
+          <w:tcPr>
+            <w:tcW w:type="dxa" w:w="2268"/>
+            <w:shd w:fill="EDF2F9"/>
+          </w:tcPr>
+          <w:p>
+            <w:pPr>
+              <w:jc w:val="center"/>
+            </w:pPr>
+            <w:r/>
+            <w:r>
+              <w:rPr>
+                <w:rFonts w:ascii="微软雅黑" w:hAnsi="微软雅黑" w:eastAsia="微软雅黑"/>
+                <w:b/>
+                <w:sz w:val="21"/>
+              </w:rPr>
+              <w:t>d.MVP/POC实验数据</w:t>
+            </w:r>
+          </w:p>
+        </w:tc>
+        <w:tc>
+          <w:tcPr>
+            <w:tcW w:type="dxa" w:w="1984"/>
+            <w:shd w:fill="EDF2F9"/>
+          </w:tcPr>
+          <w:p>
+            <w:pPr>
+              <w:jc w:val="left"/>
+            </w:pPr>
+            <w:r/>
+            <w:r>
+              <w:rPr>
+                <w:rFonts w:ascii="微软雅黑" w:hAnsi="微软雅黑" w:eastAsia="微软雅黑"/>
+                <w:b w:val="0"/>
+                <w:sz w:val="21"/>
+              </w:rPr>
+              <w:t>文档/PDF/链接</w:t>
+            </w:r>
+          </w:p>
+        </w:tc>
+        <w:tc>
+          <w:tcPr>
+            <w:tcW w:type="dxa" w:w="4535"/>
+            <w:shd w:fill="EDF2F9"/>
+          </w:tcPr>
+          <w:p>
+            <w:pPr>
+              <w:jc w:val="left"/>
+            </w:pPr>
+            <w:r/>
+            <w:r>
+              <w:rPr>
+                <w:rFonts w:ascii="微软雅黑" w:hAnsi="微软雅黑" w:eastAsia="微软雅黑"/>
+                <w:b w:val="0"/>
+                <w:sz w:val="21"/>
+              </w:rPr>
+              <w:t>FinAgentPro_MVP_POC实验数据.docx</w:t>
+              <w:br/>
+              <w:t>含8项KPI+5项功能实验+性能基准</w:t>
+            </w:r>
+          </w:p>
+        </w:tc>
+      </w:tr>
+    </w:tbl>
+    <w:p/>
+    <w:p>
+      <w:pPr>
+        <w:spacing w:after="200" w:before="360"/>
+        <w:jc w:val="left"/>
+        <w:pBdr>
+          <w:bottom w:val="single" w:sz="8" w:space="4" w:color="1A3C6E"/>
+        </w:pBdr>
+      </w:pPr>
+      <w:r>
+        <w:rPr>
+          <w:rFonts w:ascii="微软雅黑" w:hAnsi="微软雅黑" w:eastAsia="微软雅黑"/>
+          <w:b/>
+          <w:color w:val="1A3C6E"/>
+          <w:sz w:val="32"/>
+        </w:rPr>
+        <w:t>十三、提交制品清单</w:t>
       </w:r>
     </w:p>
     <w:tbl>
@@ -1088,6 +2796,369 @@
                 <w:b w:val="0"/>
                 <w:sz w:val="21"/>
               </w:rPr>
+              <w:t>解决方案描述</w:t>
+            </w:r>
+          </w:p>
+        </w:tc>
+        <w:tc>
+          <w:tcPr>
+            <w:tcW w:type="dxa" w:w="5102"/>
+            <w:shd w:fill="EDF2F9"/>
+          </w:tcPr>
+          <w:p>
+            <w:pPr>
+              <w:jc w:val="left"/>
+            </w:pPr>
+            <w:r/>
+            <w:r>
+              <w:rPr>
+                <w:rFonts w:ascii="微软雅黑" w:hAnsi="微软雅黑" w:eastAsia="微软雅黑"/>
+                <w:b w:val="0"/>
+                <w:sz w:val="21"/>
+              </w:rPr>
+              <w:t>FinAgentPro解决方案描述.docx</w:t>
+            </w:r>
+          </w:p>
+        </w:tc>
+      </w:tr>
+      <w:tr>
+        <w:tc>
+          <w:tcPr>
+            <w:tcW w:type="dxa" w:w="1134"/>
+          </w:tcPr>
+          <w:p>
+            <w:pPr>
+              <w:jc w:val="center"/>
+            </w:pPr>
+            <w:r/>
+            <w:r>
+              <w:rPr>
+                <w:rFonts w:ascii="微软雅黑" w:hAnsi="微软雅黑" w:eastAsia="微软雅黑"/>
+                <w:b/>
+                <w:sz w:val="21"/>
+              </w:rPr>
+              <w:t>7</w:t>
+            </w:r>
+          </w:p>
+        </w:tc>
+        <w:tc>
+          <w:tcPr>
+            <w:tcW w:type="dxa" w:w="2835"/>
+          </w:tcPr>
+          <w:p>
+            <w:pPr>
+              <w:jc w:val="left"/>
+            </w:pPr>
+            <w:r/>
+            <w:r>
+              <w:rPr>
+                <w:rFonts w:ascii="微软雅黑" w:hAnsi="微软雅黑" w:eastAsia="微软雅黑"/>
+                <w:b w:val="0"/>
+                <w:sz w:val="21"/>
+              </w:rPr>
+              <w:t>市场竞争分析</w:t>
+            </w:r>
+          </w:p>
+        </w:tc>
+        <w:tc>
+          <w:tcPr>
+            <w:tcW w:type="dxa" w:w="5102"/>
+          </w:tcPr>
+          <w:p>
+            <w:pPr>
+              <w:jc w:val="left"/>
+            </w:pPr>
+            <w:r/>
+            <w:r>
+              <w:rPr>
+                <w:rFonts w:ascii="微软雅黑" w:hAnsi="微软雅黑" w:eastAsia="微软雅黑"/>
+                <w:b w:val="0"/>
+                <w:sz w:val="21"/>
+              </w:rPr>
+              <w:t>FinAgentPro市场竞争分析.docx</w:t>
+            </w:r>
+          </w:p>
+        </w:tc>
+      </w:tr>
+      <w:tr>
+        <w:tc>
+          <w:tcPr>
+            <w:tcW w:type="dxa" w:w="1134"/>
+            <w:shd w:fill="EDF2F9"/>
+          </w:tcPr>
+          <w:p>
+            <w:pPr>
+              <w:jc w:val="center"/>
+            </w:pPr>
+            <w:r/>
+            <w:r>
+              <w:rPr>
+                <w:rFonts w:ascii="微软雅黑" w:hAnsi="微软雅黑" w:eastAsia="微软雅黑"/>
+                <w:b/>
+                <w:sz w:val="21"/>
+              </w:rPr>
+              <w:t>8</w:t>
+            </w:r>
+          </w:p>
+        </w:tc>
+        <w:tc>
+          <w:tcPr>
+            <w:tcW w:type="dxa" w:w="2835"/>
+            <w:shd w:fill="EDF2F9"/>
+          </w:tcPr>
+          <w:p>
+            <w:pPr>
+              <w:jc w:val="left"/>
+            </w:pPr>
+            <w:r/>
+            <w:r>
+              <w:rPr>
+                <w:rFonts w:ascii="微软雅黑" w:hAnsi="微软雅黑" w:eastAsia="微软雅黑"/>
+                <w:b w:val="0"/>
+                <w:sz w:val="21"/>
+              </w:rPr>
+              <w:t>核心技术</w:t>
+            </w:r>
+          </w:p>
+        </w:tc>
+        <w:tc>
+          <w:tcPr>
+            <w:tcW w:type="dxa" w:w="5102"/>
+            <w:shd w:fill="EDF2F9"/>
+          </w:tcPr>
+          <w:p>
+            <w:pPr>
+              <w:jc w:val="left"/>
+            </w:pPr>
+            <w:r/>
+            <w:r>
+              <w:rPr>
+                <w:rFonts w:ascii="微软雅黑" w:hAnsi="微软雅黑" w:eastAsia="微软雅黑"/>
+                <w:b w:val="0"/>
+                <w:sz w:val="21"/>
+              </w:rPr>
+              <w:t>FinAgentPro核心技术.docx</w:t>
+            </w:r>
+          </w:p>
+        </w:tc>
+      </w:tr>
+      <w:tr>
+        <w:tc>
+          <w:tcPr>
+            <w:tcW w:type="dxa" w:w="1134"/>
+          </w:tcPr>
+          <w:p>
+            <w:pPr>
+              <w:jc w:val="center"/>
+            </w:pPr>
+            <w:r/>
+            <w:r>
+              <w:rPr>
+                <w:rFonts w:ascii="微软雅黑" w:hAnsi="微软雅黑" w:eastAsia="微软雅黑"/>
+                <w:b/>
+                <w:sz w:val="21"/>
+              </w:rPr>
+              <w:t>9</w:t>
+            </w:r>
+          </w:p>
+        </w:tc>
+        <w:tc>
+          <w:tcPr>
+            <w:tcW w:type="dxa" w:w="2835"/>
+          </w:tcPr>
+          <w:p>
+            <w:pPr>
+              <w:jc w:val="left"/>
+            </w:pPr>
+            <w:r/>
+            <w:r>
+              <w:rPr>
+                <w:rFonts w:ascii="微软雅黑" w:hAnsi="微软雅黑" w:eastAsia="微软雅黑"/>
+                <w:b w:val="0"/>
+                <w:sz w:val="21"/>
+              </w:rPr>
+              <w:t>交互设计与流程图</w:t>
+            </w:r>
+          </w:p>
+        </w:tc>
+        <w:tc>
+          <w:tcPr>
+            <w:tcW w:type="dxa" w:w="5102"/>
+          </w:tcPr>
+          <w:p>
+            <w:pPr>
+              <w:jc w:val="left"/>
+            </w:pPr>
+            <w:r/>
+            <w:r>
+              <w:rPr>
+                <w:rFonts w:ascii="微软雅黑" w:hAnsi="微软雅黑" w:eastAsia="微软雅黑"/>
+                <w:b w:val="0"/>
+                <w:sz w:val="21"/>
+              </w:rPr>
+              <w:t>FinAgentPro交互设计与流程图.docx</w:t>
+            </w:r>
+          </w:p>
+        </w:tc>
+      </w:tr>
+      <w:tr>
+        <w:tc>
+          <w:tcPr>
+            <w:tcW w:type="dxa" w:w="1134"/>
+            <w:shd w:fill="EDF2F9"/>
+          </w:tcPr>
+          <w:p>
+            <w:pPr>
+              <w:jc w:val="center"/>
+            </w:pPr>
+            <w:r/>
+            <w:r>
+              <w:rPr>
+                <w:rFonts w:ascii="微软雅黑" w:hAnsi="微软雅黑" w:eastAsia="微软雅黑"/>
+                <w:b/>
+                <w:sz w:val="21"/>
+              </w:rPr>
+              <w:t>10</w:t>
+            </w:r>
+          </w:p>
+        </w:tc>
+        <w:tc>
+          <w:tcPr>
+            <w:tcW w:type="dxa" w:w="2835"/>
+            <w:shd w:fill="EDF2F9"/>
+          </w:tcPr>
+          <w:p>
+            <w:pPr>
+              <w:jc w:val="left"/>
+            </w:pPr>
+            <w:r/>
+            <w:r>
+              <w:rPr>
+                <w:rFonts w:ascii="微软雅黑" w:hAnsi="微软雅黑" w:eastAsia="微软雅黑"/>
+                <w:b w:val="0"/>
+                <w:sz w:val="21"/>
+              </w:rPr>
+              <w:t>MVP/POC实验数据</w:t>
+            </w:r>
+          </w:p>
+        </w:tc>
+        <w:tc>
+          <w:tcPr>
+            <w:tcW w:type="dxa" w:w="5102"/>
+            <w:shd w:fill="EDF2F9"/>
+          </w:tcPr>
+          <w:p>
+            <w:pPr>
+              <w:jc w:val="left"/>
+            </w:pPr>
+            <w:r/>
+            <w:r>
+              <w:rPr>
+                <w:rFonts w:ascii="微软雅黑" w:hAnsi="微软雅黑" w:eastAsia="微软雅黑"/>
+                <w:b w:val="0"/>
+                <w:sz w:val="21"/>
+              </w:rPr>
+              <w:t>FinAgentPro_MVP_POC实验数据.docx</w:t>
+            </w:r>
+          </w:p>
+        </w:tc>
+      </w:tr>
+      <w:tr>
+        <w:tc>
+          <w:tcPr>
+            <w:tcW w:type="dxa" w:w="1134"/>
+          </w:tcPr>
+          <w:p>
+            <w:pPr>
+              <w:jc w:val="center"/>
+            </w:pPr>
+            <w:r/>
+            <w:r>
+              <w:rPr>
+                <w:rFonts w:ascii="微软雅黑" w:hAnsi="微软雅黑" w:eastAsia="微软雅黑"/>
+                <w:b/>
+                <w:sz w:val="21"/>
+              </w:rPr>
+              <w:t>11</w:t>
+            </w:r>
+          </w:p>
+        </w:tc>
+        <w:tc>
+          <w:tcPr>
+            <w:tcW w:type="dxa" w:w="2835"/>
+          </w:tcPr>
+          <w:p>
+            <w:pPr>
+              <w:jc w:val="left"/>
+            </w:pPr>
+            <w:r/>
+            <w:r>
+              <w:rPr>
+                <w:rFonts w:ascii="微软雅黑" w:hAnsi="微软雅黑" w:eastAsia="微软雅黑"/>
+                <w:b w:val="0"/>
+                <w:sz w:val="21"/>
+              </w:rPr>
+              <w:t>报名信息表</w:t>
+            </w:r>
+          </w:p>
+        </w:tc>
+        <w:tc>
+          <w:tcPr>
+            <w:tcW w:type="dxa" w:w="5102"/>
+          </w:tcPr>
+          <w:p>
+            <w:pPr>
+              <w:jc w:val="left"/>
+            </w:pPr>
+            <w:r/>
+            <w:r>
+              <w:rPr>
+                <w:rFonts w:ascii="微软雅黑" w:hAnsi="微软雅黑" w:eastAsia="微软雅黑"/>
+                <w:b w:val="0"/>
+                <w:sz w:val="21"/>
+              </w:rPr>
+              <w:t>AFAC2026报名信息表.docx</w:t>
+            </w:r>
+          </w:p>
+        </w:tc>
+      </w:tr>
+      <w:tr>
+        <w:tc>
+          <w:tcPr>
+            <w:tcW w:type="dxa" w:w="1134"/>
+            <w:shd w:fill="EDF2F9"/>
+          </w:tcPr>
+          <w:p>
+            <w:pPr>
+              <w:jc w:val="center"/>
+            </w:pPr>
+            <w:r/>
+            <w:r>
+              <w:rPr>
+                <w:rFonts w:ascii="微软雅黑" w:hAnsi="微软雅黑" w:eastAsia="微软雅黑"/>
+                <w:b/>
+                <w:sz w:val="21"/>
+              </w:rPr>
+              <w:t>12</w:t>
+            </w:r>
+          </w:p>
+        </w:tc>
+        <w:tc>
+          <w:tcPr>
+            <w:tcW w:type="dxa" w:w="2835"/>
+            <w:shd w:fill="EDF2F9"/>
+          </w:tcPr>
+          <w:p>
+            <w:pPr>
+              <w:jc w:val="left"/>
+            </w:pPr>
+            <w:r/>
+            <w:r>
+              <w:rPr>
+                <w:rFonts w:ascii="微软雅黑" w:hAnsi="微软雅黑" w:eastAsia="微软雅黑"/>
+                <w:b w:val="0"/>
+                <w:sz w:val="21"/>
+              </w:rPr>
               <w:t>源代码</w:t>
             </w:r>
           </w:p>
@@ -1130,7 +3201,7 @@
           <w:color w:val="1A3C6E"/>
           <w:sz w:val="32"/>
         </w:rPr>
-        <w:t>六、关键时间节点</w:t>
+        <w:t>十四、关键时间节点</w:t>
       </w:r>
     </w:p>
     <w:tbl>

</xml_diff>